<commit_message>
chinh sua cau a
</commit_message>
<xml_diff>
--- a/doc/04-NguyenMinhLy.docx
+++ b/doc/04-NguyenMinhLy.docx
@@ -121,16 +121,7 @@
           <w:sz w:val="26"/>
           <w:szCs w:val="26"/>
         </w:rPr>
-        <w:t xml:space="preserve">Thành viên </w:t>
-      </w:r>
-      <w:proofErr w:type="gramStart"/>
-      <w:r>
-        <w:rPr>
-          <w:rFonts w:ascii="Times New Roman" w:hAnsi="Times New Roman" w:cs="Times New Roman"/>
-          <w:sz w:val="26"/>
-          <w:szCs w:val="26"/>
-        </w:rPr>
-        <w:t>nhóm</w:t>
+        <w:t>Thành viên nhóm</w:t>
       </w:r>
       <w:r>
         <w:rPr>
@@ -140,7 +131,6 @@
         </w:rPr>
         <w:t xml:space="preserve"> :</w:t>
       </w:r>
-      <w:proofErr w:type="gramEnd"/>
     </w:p>
     <w:p>
       <w:pPr>
@@ -778,6 +768,28 @@
           <w:szCs w:val="26"/>
         </w:rPr>
         <w:t>:</w:t>
+      </w:r>
+    </w:p>
+    <w:p>
+      <w:pPr>
+        <w:pStyle w:val="ListParagraph"/>
+        <w:spacing w:after="120" w:line="240" w:lineRule="auto"/>
+        <w:jc w:val="both"/>
+        <w:rPr>
+          <w:rFonts w:ascii="Times New Roman" w:hAnsi="Times New Roman" w:cs="Times New Roman"/>
+          <w:b/>
+          <w:sz w:val="26"/>
+          <w:szCs w:val="26"/>
+        </w:rPr>
+      </w:pPr>
+      <w:r>
+        <w:rPr>
+          <w:rFonts w:ascii="Times New Roman" w:hAnsi="Times New Roman" w:cs="Times New Roman"/>
+          <w:b/>
+          <w:sz w:val="26"/>
+          <w:szCs w:val="26"/>
+        </w:rPr>
+        <w:t>….</w:t>
       </w:r>
     </w:p>
     <w:p>
@@ -1951,7 +1963,6 @@
           <w:sz w:val="26"/>
           <w:szCs w:val="26"/>
         </w:rPr>
-        <w:lastRenderedPageBreak/>
         <w:t>Sơ đồ phân cấp chức năng của ứng dụn</w:t>
       </w:r>
       <w:r>

</xml_diff>